<commit_message>
test(OPS-C1): pin OPS-02's attendee band and facilitator role, rebuild DOCX
Adversarial freeze review (F7): the screen checked section 2.2's "5 to
6 attendees, facilitator an Operations/Program Manager" cardinality by
hand but never enforced it. Adds two assertions, mutation-checked:

- the metadata Attendees list parses to 5 to 6 entries, each resolving
  to an active roster row (mutation: dropping to 4 entries fails with
  "OPS-02 metadata lists 4 attendees, outside the 5 to 6 band").
- the metadata Facilitator line resolves to an active roster row whose
  role title is Operations Manager or Program Manager, the plan's rule
  (mutation: retitling to "Operations Analyst" fails resolveActive with
  "resolves to 0 active roster rows, expected exactly 1").

Rebuilds the three DOCX outputs, stale since the prior commit's source
.md edits.

Co-Authored-By: Claude Fable 5 <noreply@anthropic.com>
Claude-Session: 401b4daa-602c-451d-b686-faf3902d546a
</commit_message>
<xml_diff>
--- a/artifacts/OPS-03B/build/follow-up-email-thread.docx
+++ b/artifacts/OPS-03B/build/follow-up-email-thread.docx
@@ -219,7 +219,7 @@
         <w:pStyle w:val="BodyText"/>
       </w:pPr>
       <w:r>
-        <w:t xml:space="preserve">Adding the template answer, since it came up straight after the sequencing question and people keep asking me about it separately.</w:t>
+        <w:t xml:space="preserve">Adding the template answer, since it came up later in the same sync and people keep asking me about it separately.</w:t>
       </w:r>
     </w:p>
     <w:p>
@@ -439,7 +439,7 @@
         <w:pStyle w:val="BodyText"/>
       </w:pPr>
       <w:r>
-        <w:t xml:space="preserve">On staging, no, and the reason is the reason the hold exists at all. Two moving parts at once make a failure impossible to attribute, and the last migration is the example everybody in the room reached for.</w:t>
+        <w:t xml:space="preserve">On staging, no, and the reason is the reason the hold exists at all. Two moving parts at once make a failure impossible to attribute, and if something breaks while both are moving, nobody can say which one broke it.</w:t>
       </w:r>
     </w:p>
     <w:p>

</xml_diff>